<commit_message>
Correction 8 : T33 (activites cliniques/partenaires prives) en detail par ligne
Le tableau 3.3 restait a 4 colonnes (activite, espece, maladie, effectif),
insuffisant pour identifier qui a fait quoi, ou et quand. Etendu a 10
colonnes par intervention : clinique/partenaire, localite, date,
activite, espece, maladie, nombre de cas, morts, mesures/actions,
observations -- toujours une ligne par intervention, jamais remplacee
par un total (le moteur de rendu groupe deja par arrondissement avec
sous-total, verifie via generation reelle du rapport departemental).

Ne pas pousser vers Railway avant l'accord final du DD (11 corrections
au total, poussee groupee prevue a la fin).

Co-Authored-By: Claude Sonnet 5 <noreply@anthropic.com>
</commit_message>
<xml_diff>
--- a/templates/rapport_mensuel_DA.docx
+++ b/templates/rapport_mensuel_DA.docx
@@ -5001,6 +5001,12 @@
         <w:gridCol w:w="100"/>
         <w:gridCol w:w="100"/>
         <w:gridCol w:w="100"/>
+        <w:gridCol w:w="100"/>
+        <w:gridCol w:w="100"/>
+        <w:gridCol w:w="100"/>
+        <w:gridCol w:w="100"/>
+        <w:gridCol w:w="100"/>
+        <w:gridCol w:w="100"/>
       </w:tblGrid>
       <w:tr>
         <w:tc>
@@ -5010,7 +5016,40 @@
                 <w:b/>
                 <w:bCs/>
               </w:rPr>
-              <w:t xml:space="preserve">Activité</w:t>
+              <w:t xml:space="preserve">Clinique ou partenaire</w:t>
+            </w:r>
+          </w:p>
+        </w:tc>
+        <w:tc>
+          <w:p>
+            <w:r>
+              <w:rPr>
+                <w:b/>
+                <w:bCs/>
+              </w:rPr>
+              <w:t xml:space="preserve">Localité</w:t>
+            </w:r>
+          </w:p>
+        </w:tc>
+        <w:tc>
+          <w:p>
+            <w:r>
+              <w:rPr>
+                <w:b/>
+                <w:bCs/>
+              </w:rPr>
+              <w:t xml:space="preserve">Date de l'activité</w:t>
+            </w:r>
+          </w:p>
+        </w:tc>
+        <w:tc>
+          <w:p>
+            <w:r>
+              <w:rPr>
+                <w:b/>
+                <w:bCs/>
+              </w:rPr>
+              <w:t xml:space="preserve">Activité ou intervention réalisée</w:t>
             </w:r>
           </w:p>
         </w:tc>
@@ -5043,16 +5082,70 @@
                 <w:b/>
                 <w:bCs/>
               </w:rPr>
-              <w:t xml:space="preserve">Effectif</w:t>
-            </w:r>
-          </w:p>
-        </w:tc>
-      </w:tr>
-      <w:tr>
-        <w:tc>
-          <w:p>
-            <w:r>
-              <w:t xml:space="preserve">{#T33}{activite}</w:t>
+              <w:t xml:space="preserve">Nombre de cas ou d'animaux pris en charge</w:t>
+            </w:r>
+          </w:p>
+        </w:tc>
+        <w:tc>
+          <w:p>
+            <w:r>
+              <w:rPr>
+                <w:b/>
+                <w:bCs/>
+              </w:rPr>
+              <w:t xml:space="preserve">Morts</w:t>
+            </w:r>
+          </w:p>
+        </w:tc>
+        <w:tc>
+          <w:p>
+            <w:r>
+              <w:rPr>
+                <w:b/>
+                <w:bCs/>
+              </w:rPr>
+              <w:t xml:space="preserve">Mesures ou actions réalisées</w:t>
+            </w:r>
+          </w:p>
+        </w:tc>
+        <w:tc>
+          <w:p>
+            <w:r>
+              <w:rPr>
+                <w:b/>
+                <w:bCs/>
+              </w:rPr>
+              <w:t xml:space="preserve">Observations</w:t>
+            </w:r>
+          </w:p>
+        </w:tc>
+      </w:tr>
+      <w:tr>
+        <w:tc>
+          <w:p>
+            <w:r>
+              <w:t xml:space="preserve">{#T33}{structure}</w:t>
+            </w:r>
+          </w:p>
+        </w:tc>
+        <w:tc>
+          <w:p>
+            <w:r>
+              <w:t xml:space="preserve">{localite}</w:t>
+            </w:r>
+          </w:p>
+        </w:tc>
+        <w:tc>
+          <w:p>
+            <w:r>
+              <w:t xml:space="preserve">{date}</w:t>
+            </w:r>
+          </w:p>
+        </w:tc>
+        <w:tc>
+          <w:p>
+            <w:r>
+              <w:t xml:space="preserve">{activite}</w:t>
             </w:r>
           </w:p>
         </w:tc>
@@ -5073,7 +5166,28 @@
         <w:tc>
           <w:p>
             <w:r>
-              <w:t xml:space="preserve">{effectif}{/T33}</w:t>
+              <w:t xml:space="preserve">{effectif}</w:t>
+            </w:r>
+          </w:p>
+        </w:tc>
+        <w:tc>
+          <w:p>
+            <w:r>
+              <w:t xml:space="preserve">{morts}</w:t>
+            </w:r>
+          </w:p>
+        </w:tc>
+        <w:tc>
+          <w:p>
+            <w:r>
+              <w:t xml:space="preserve">{mesuresActions}</w:t>
+            </w:r>
+          </w:p>
+        </w:tc>
+        <w:tc>
+          <w:p>
+            <w:r>
+              <w:t xml:space="preserve">{observations}{/T33}</w:t>
             </w:r>
           </w:p>
         </w:tc>
@@ -5119,10 +5233,76 @@
                 <w:b/>
                 <w:bCs/>
               </w:rPr>
+              <w:t xml:space="preserve"/>
+            </w:r>
+          </w:p>
+        </w:tc>
+        <w:tc>
+          <w:p>
+            <w:r>
+              <w:rPr>
+                <w:b/>
+                <w:bCs/>
+              </w:rPr>
+              <w:t xml:space="preserve"/>
+            </w:r>
+          </w:p>
+        </w:tc>
+        <w:tc>
+          <w:p>
+            <w:r>
+              <w:rPr>
+                <w:b/>
+                <w:bCs/>
+              </w:rPr>
+              <w:t xml:space="preserve"/>
+            </w:r>
+          </w:p>
+        </w:tc>
+        <w:tc>
+          <w:p>
+            <w:r>
+              <w:rPr>
+                <w:b/>
+                <w:bCs/>
+              </w:rPr>
               <w:t xml:space="preserve">{T33_effectif_TOTAL}</w:t>
             </w:r>
           </w:p>
         </w:tc>
+        <w:tc>
+          <w:p>
+            <w:r>
+              <w:rPr>
+                <w:b/>
+                <w:bCs/>
+              </w:rPr>
+              <w:t xml:space="preserve">{T33_morts_TOTAL}</w:t>
+            </w:r>
+          </w:p>
+        </w:tc>
+        <w:tc>
+          <w:p>
+            <w:r>
+              <w:rPr>
+                <w:b/>
+                <w:bCs/>
+              </w:rPr>
+              <w:t xml:space="preserve"/>
+            </w:r>
+          </w:p>
+        </w:tc>
+        <w:tc>
+          <w:p>
+            <w:r>
+              <w:rPr>
+                <w:b/>
+                <w:bCs/>
+              </w:rPr>
+              <w:t xml:space="preserve"/>
+            </w:r>
+          </w:p>
+        </w:tc>
       </w:tr>
       <w:tr>
         <w:tc>
@@ -5149,7 +5329,49 @@
         <w:tc>
           <w:p>
             <w:r>
+              <w:t xml:space="preserve"/>
+            </w:r>
+          </w:p>
+        </w:tc>
+        <w:tc>
+          <w:p>
+            <w:r>
+              <w:t xml:space="preserve"/>
+            </w:r>
+          </w:p>
+        </w:tc>
+        <w:tc>
+          <w:p>
+            <w:r>
+              <w:t xml:space="preserve"/>
+            </w:r>
+          </w:p>
+        </w:tc>
+        <w:tc>
+          <w:p>
+            <w:r>
               <w:t xml:space="preserve">{T33_effectif_TOTAL_PREC}</w:t>
+            </w:r>
+          </w:p>
+        </w:tc>
+        <w:tc>
+          <w:p>
+            <w:r>
+              <w:t xml:space="preserve">{T33_morts_TOTAL_PREC}</w:t>
+            </w:r>
+          </w:p>
+        </w:tc>
+        <w:tc>
+          <w:p>
+            <w:r>
+              <w:t xml:space="preserve"/>
+            </w:r>
+          </w:p>
+        </w:tc>
+        <w:tc>
+          <w:p>
+            <w:r>
+              <w:t xml:space="preserve"/>
             </w:r>
           </w:p>
         </w:tc>

</xml_diff>

<commit_message>
En-tete officiel des rapports DD/DA/exact : image fournie par le DD, centree
Remplace l'en-tete bilingue recree en texte (logo MINEPIA absent, mise en
page divergente du document officiel) par l'image exacte transmise par
le DD, centree en haut de chaque rapport genere. Templates DD/DA/exact
regeneres et verifies (image bien incluse dans word/media/).

Co-Authored-By: Claude Sonnet 5 <noreply@anthropic.com>
</commit_message>
<xml_diff>
--- a/templates/rapport_mensuel_DA.docx
+++ b/templates/rapport_mensuel_DA.docx
@@ -2,323 +2,51 @@
 <file path=word/document.xml><?xml version="1.0" encoding="utf-8"?>
 <w:document xmlns:wpc="http://schemas.microsoft.com/office/word/2010/wordprocessingCanvas" xmlns:mc="http://schemas.openxmlformats.org/markup-compatibility/2006" xmlns:o="urn:schemas-microsoft-com:office:office" xmlns:r="http://schemas.openxmlformats.org/officeDocument/2006/relationships" xmlns:m="http://schemas.openxmlformats.org/officeDocument/2006/math" xmlns:v="urn:schemas-microsoft-com:vml" xmlns:wp14="http://schemas.microsoft.com/office/word/2010/wordprocessingDrawing" xmlns:wp="http://schemas.openxmlformats.org/drawingml/2006/wordprocessingDrawing" xmlns:w10="urn:schemas-microsoft-com:office:word" xmlns:w="http://schemas.openxmlformats.org/wordprocessingml/2006/main" xmlns:w14="http://schemas.microsoft.com/office/word/2010/wordml" xmlns:w15="http://schemas.microsoft.com/office/word/2012/wordml" xmlns:wpg="http://schemas.microsoft.com/office/word/2010/wordprocessingGroup" xmlns:wpi="http://schemas.microsoft.com/office/word/2010/wordprocessingInk" xmlns:wne="http://schemas.microsoft.com/office/word/2006/wordml" xmlns:wps="http://schemas.microsoft.com/office/word/2010/wordprocessingShape" xmlns:cx="http://schemas.microsoft.com/office/drawing/2014/chartex" xmlns:cx1="http://schemas.microsoft.com/office/drawing/2015/9/8/chartex" xmlns:cx2="http://schemas.microsoft.com/office/drawing/2015/10/21/chartex" xmlns:cx3="http://schemas.microsoft.com/office/drawing/2016/5/9/chartex" xmlns:cx4="http://schemas.microsoft.com/office/drawing/2016/5/10/chartex" xmlns:cx5="http://schemas.microsoft.com/office/drawing/2016/5/11/chartex" xmlns:cx6="http://schemas.microsoft.com/office/drawing/2016/5/12/chartex" xmlns:cx7="http://schemas.microsoft.com/office/drawing/2016/5/13/chartex" xmlns:cx8="http://schemas.microsoft.com/office/drawing/2016/5/14/chartex" xmlns:aink="http://schemas.microsoft.com/office/drawing/2016/ink" xmlns:am3d="http://schemas.microsoft.com/office/drawing/2017/model3d" xmlns:w16cex="http://schemas.microsoft.com/office/word/2018/wordml/cex" xmlns:w16cid="http://schemas.microsoft.com/office/word/2016/wordml/cid" xmlns:w16="http://schemas.microsoft.com/office/word/2018/wordml" xmlns:w16sdtdh="http://schemas.microsoft.com/office/word/2020/wordml/sdtdatahash" xmlns:w16se="http://schemas.microsoft.com/office/word/2015/wordml/symex" mc:Ignorable="w14 w15 wp14">
   <w:body>
-    <w:tbl>
-      <w:tblPr>
-        <w:tblW w:type="pct" w:w="100%"/>
-        <w:tblBorders>
-          <w:top w:val="single" w:color="auto" w:sz="4"/>
-          <w:left w:val="single" w:color="auto" w:sz="4"/>
-          <w:bottom w:val="single" w:color="auto" w:sz="4"/>
-          <w:right w:val="single" w:color="auto" w:sz="4"/>
-          <w:insideH w:val="single" w:color="auto" w:sz="4"/>
-          <w:insideV w:val="single" w:color="auto" w:sz="4"/>
-        </w:tblBorders>
-      </w:tblPr>
-      <w:tblGrid>
-        <w:gridCol w:w="100"/>
-        <w:gridCol w:w="100"/>
-      </w:tblGrid>
-      <w:tr>
-        <w:tc>
-          <w:tcPr>
-            <w:tcBorders>
-              <w:top w:val="none" w:color="FFFFFF" w:sz="0"/>
-              <w:left w:val="none" w:color="FFFFFF" w:sz="0"/>
-              <w:bottom w:val="none" w:color="FFFFFF" w:sz="0"/>
-              <w:right w:val="none" w:color="FFFFFF" w:sz="0"/>
-            </w:tcBorders>
-          </w:tcPr>
-          <w:p>
-            <w:pPr>
-              <w:jc w:val="center"/>
-            </w:pPr>
-            <w:r>
-              <w:rPr>
-                <w:b/>
-                <w:bCs/>
-                <w:sz w:val="22"/>
-                <w:szCs w:val="22"/>
-              </w:rPr>
-              <w:t xml:space="preserve">RÉPUBLIQUE DU CAMEROUN</w:t>
-            </w:r>
-          </w:p>
-        </w:tc>
-        <w:tc>
-          <w:tcPr>
-            <w:tcBorders>
-              <w:top w:val="none" w:color="FFFFFF" w:sz="0"/>
-              <w:left w:val="none" w:color="FFFFFF" w:sz="0"/>
-              <w:bottom w:val="none" w:color="FFFFFF" w:sz="0"/>
-              <w:right w:val="none" w:color="FFFFFF" w:sz="0"/>
-            </w:tcBorders>
-          </w:tcPr>
-          <w:p>
-            <w:pPr>
-              <w:jc w:val="center"/>
-            </w:pPr>
-            <w:r>
-              <w:rPr>
-                <w:b/>
-                <w:bCs/>
-                <w:sz w:val="22"/>
-                <w:szCs w:val="22"/>
-              </w:rPr>
-              <w:t xml:space="preserve">REPUBLIC OF CAMEROON</w:t>
-            </w:r>
-          </w:p>
-        </w:tc>
-      </w:tr>
-      <w:tr>
-        <w:tc>
-          <w:tcPr>
-            <w:tcBorders>
-              <w:top w:val="none" w:color="FFFFFF" w:sz="0"/>
-              <w:left w:val="none" w:color="FFFFFF" w:sz="0"/>
-              <w:bottom w:val="none" w:color="FFFFFF" w:sz="0"/>
-              <w:right w:val="none" w:color="FFFFFF" w:sz="0"/>
-            </w:tcBorders>
-          </w:tcPr>
-          <w:p>
-            <w:pPr>
-              <w:jc w:val="center"/>
-            </w:pPr>
-            <w:r>
-              <w:rPr>
-                <w:b w:val="false"/>
-                <w:bCs w:val="false"/>
-                <w:sz w:val="18"/>
-                <w:szCs w:val="18"/>
-              </w:rPr>
-              <w:t xml:space="preserve">Paix – Travail – Patrie</w:t>
-            </w:r>
-          </w:p>
-        </w:tc>
-        <w:tc>
-          <w:tcPr>
-            <w:tcBorders>
-              <w:top w:val="none" w:color="FFFFFF" w:sz="0"/>
-              <w:left w:val="none" w:color="FFFFFF" w:sz="0"/>
-              <w:bottom w:val="none" w:color="FFFFFF" w:sz="0"/>
-              <w:right w:val="none" w:color="FFFFFF" w:sz="0"/>
-            </w:tcBorders>
-          </w:tcPr>
-          <w:p>
-            <w:pPr>
-              <w:jc w:val="center"/>
-            </w:pPr>
-            <w:r>
-              <w:rPr>
-                <w:b w:val="false"/>
-                <w:bCs w:val="false"/>
-                <w:sz w:val="18"/>
-                <w:szCs w:val="18"/>
-              </w:rPr>
-              <w:t xml:space="preserve">Peace – Work – Fatherland</w:t>
-            </w:r>
-          </w:p>
-        </w:tc>
-      </w:tr>
-      <w:tr>
-        <w:tc>
-          <w:tcPr>
-            <w:tcBorders>
-              <w:top w:val="none" w:color="FFFFFF" w:sz="0"/>
-              <w:left w:val="none" w:color="FFFFFF" w:sz="0"/>
-              <w:bottom w:val="none" w:color="FFFFFF" w:sz="0"/>
-              <w:right w:val="none" w:color="FFFFFF" w:sz="0"/>
-            </w:tcBorders>
-          </w:tcPr>
-          <w:p>
-            <w:pPr>
-              <w:jc w:val="center"/>
-            </w:pPr>
-            <w:r>
-              <w:rPr>
-                <w:b w:val="false"/>
-                <w:bCs w:val="false"/>
-                <w:sz w:val="18"/>
-                <w:szCs w:val="18"/>
-              </w:rPr>
-              <w:t xml:space="preserve">RÉGION DE L'OUEST</w:t>
-            </w:r>
-          </w:p>
-        </w:tc>
-        <w:tc>
-          <w:tcPr>
-            <w:tcBorders>
-              <w:top w:val="none" w:color="FFFFFF" w:sz="0"/>
-              <w:left w:val="none" w:color="FFFFFF" w:sz="0"/>
-              <w:bottom w:val="none" w:color="FFFFFF" w:sz="0"/>
-              <w:right w:val="none" w:color="FFFFFF" w:sz="0"/>
-            </w:tcBorders>
-          </w:tcPr>
-          <w:p>
-            <w:pPr>
-              <w:jc w:val="center"/>
-            </w:pPr>
-            <w:r>
-              <w:rPr>
-                <w:b w:val="false"/>
-                <w:bCs w:val="false"/>
-                <w:sz w:val="18"/>
-                <w:szCs w:val="18"/>
-              </w:rPr>
-              <w:t xml:space="preserve">WEST REGION</w:t>
-            </w:r>
-          </w:p>
-        </w:tc>
-      </w:tr>
-      <w:tr>
-        <w:tc>
-          <w:tcPr>
-            <w:tcBorders>
-              <w:top w:val="none" w:color="FFFFFF" w:sz="0"/>
-              <w:left w:val="none" w:color="FFFFFF" w:sz="0"/>
-              <w:bottom w:val="none" w:color="FFFFFF" w:sz="0"/>
-              <w:right w:val="none" w:color="FFFFFF" w:sz="0"/>
-            </w:tcBorders>
-          </w:tcPr>
-          <w:p>
-            <w:pPr>
-              <w:jc w:val="center"/>
-            </w:pPr>
-            <w:r>
-              <w:rPr>
-                <w:b w:val="false"/>
-                <w:bCs w:val="false"/>
-                <w:sz w:val="18"/>
-                <w:szCs w:val="18"/>
-              </w:rPr>
-              <w:t xml:space="preserve">DÉPARTEMENT DE LA MENOUA</w:t>
-            </w:r>
-          </w:p>
-        </w:tc>
-        <w:tc>
-          <w:tcPr>
-            <w:tcBorders>
-              <w:top w:val="none" w:color="FFFFFF" w:sz="0"/>
-              <w:left w:val="none" w:color="FFFFFF" w:sz="0"/>
-              <w:bottom w:val="none" w:color="FFFFFF" w:sz="0"/>
-              <w:right w:val="none" w:color="FFFFFF" w:sz="0"/>
-            </w:tcBorders>
-          </w:tcPr>
-          <w:p>
-            <w:pPr>
-              <w:jc w:val="center"/>
-            </w:pPr>
-            <w:r>
-              <w:rPr>
-                <w:b w:val="false"/>
-                <w:bCs w:val="false"/>
-                <w:sz w:val="18"/>
-                <w:szCs w:val="18"/>
-              </w:rPr>
-              <w:t xml:space="preserve">MENOUA DIVISION</w:t>
-            </w:r>
-          </w:p>
-        </w:tc>
-      </w:tr>
-      <w:tr>
-        <w:tc>
-          <w:tcPr>
-            <w:tcBorders>
-              <w:top w:val="none" w:color="FFFFFF" w:sz="0"/>
-              <w:left w:val="none" w:color="FFFFFF" w:sz="0"/>
-              <w:bottom w:val="none" w:color="FFFFFF" w:sz="0"/>
-              <w:right w:val="none" w:color="FFFFFF" w:sz="0"/>
-            </w:tcBorders>
-          </w:tcPr>
-          <w:p>
-            <w:pPr>
-              <w:jc w:val="center"/>
-            </w:pPr>
-            <w:r>
-              <w:rPr>
-                <w:b w:val="false"/>
-                <w:bCs w:val="false"/>
-                <w:sz w:val="18"/>
-                <w:szCs w:val="18"/>
-              </w:rPr>
-              <w:t xml:space="preserve">DÉLÉGATION DÉPARTEMENTALE DE L'ÉLEVAGE,</w:t>
-            </w:r>
-          </w:p>
-        </w:tc>
-        <w:tc>
-          <w:tcPr>
-            <w:tcBorders>
-              <w:top w:val="none" w:color="FFFFFF" w:sz="0"/>
-              <w:left w:val="none" w:color="FFFFFF" w:sz="0"/>
-              <w:bottom w:val="none" w:color="FFFFFF" w:sz="0"/>
-              <w:right w:val="none" w:color="FFFFFF" w:sz="0"/>
-            </w:tcBorders>
-          </w:tcPr>
-          <w:p>
-            <w:pPr>
-              <w:jc w:val="center"/>
-            </w:pPr>
-            <w:r>
-              <w:rPr>
-                <w:b w:val="false"/>
-                <w:bCs w:val="false"/>
-                <w:sz w:val="18"/>
-                <w:szCs w:val="18"/>
-              </w:rPr>
-              <w:t xml:space="preserve">DIVISIONAL DELEGATION OF LIVESTOCK,</w:t>
-            </w:r>
-          </w:p>
-        </w:tc>
-      </w:tr>
-      <w:tr>
-        <w:tc>
-          <w:tcPr>
-            <w:tcBorders>
-              <w:top w:val="none" w:color="FFFFFF" w:sz="0"/>
-              <w:left w:val="none" w:color="FFFFFF" w:sz="0"/>
-              <w:bottom w:val="none" w:color="FFFFFF" w:sz="0"/>
-              <w:right w:val="none" w:color="FFFFFF" w:sz="0"/>
-            </w:tcBorders>
-          </w:tcPr>
-          <w:p>
-            <w:pPr>
-              <w:jc w:val="center"/>
-            </w:pPr>
-            <w:r>
-              <w:rPr>
-                <w:b w:val="false"/>
-                <w:bCs w:val="false"/>
-                <w:sz w:val="18"/>
-                <w:szCs w:val="18"/>
-              </w:rPr>
-              <w:t xml:space="preserve">DES PÊCHES ET DES INDUSTRIES ANIMALES</w:t>
-            </w:r>
-          </w:p>
-        </w:tc>
-        <w:tc>
-          <w:tcPr>
-            <w:tcBorders>
-              <w:top w:val="none" w:color="FFFFFF" w:sz="0"/>
-              <w:left w:val="none" w:color="FFFFFF" w:sz="0"/>
-              <w:bottom w:val="none" w:color="FFFFFF" w:sz="0"/>
-              <w:right w:val="none" w:color="FFFFFF" w:sz="0"/>
-            </w:tcBorders>
-          </w:tcPr>
-          <w:p>
-            <w:pPr>
-              <w:jc w:val="center"/>
-            </w:pPr>
-            <w:r>
-              <w:rPr>
-                <w:b w:val="false"/>
-                <w:bCs w:val="false"/>
-                <w:sz w:val="18"/>
-                <w:szCs w:val="18"/>
-              </w:rPr>
-              <w:t xml:space="preserve">FISHERIES AND ANIMAL INDUSTRIES</w:t>
-            </w:r>
-          </w:p>
-        </w:tc>
-      </w:tr>
-    </w:tbl>
+    <w:p>
+      <w:pPr>
+        <w:jc w:val="center"/>
+      </w:pPr>
+      <w:r>
+        <w:drawing>
+          <wp:inline distT="0" distB="0" distL="0" distR="0">
+            <wp:extent cx="5905500" cy="1295400"/>
+            <wp:effectExtent t="0" r="0" b="0" l="0"/>
+            <wp:docPr id="1" name="" descr="" title=""/>
+            <wp:cNvGraphicFramePr>
+              <a:graphicFrameLocks xmlns:a="http://schemas.openxmlformats.org/drawingml/2006/main" noChangeAspect="1"/>
+            </wp:cNvGraphicFramePr>
+            <a:graphic xmlns:a="http://schemas.openxmlformats.org/drawingml/2006/main">
+              <a:graphicData uri="http://schemas.openxmlformats.org/drawingml/2006/picture">
+                <pic:pic xmlns:pic="http://schemas.openxmlformats.org/drawingml/2006/picture">
+                  <pic:nvPicPr>
+                    <pic:cNvPr id="0" name="" descr=""/>
+                    <pic:cNvPicPr>
+                      <a:picLocks noChangeAspect="1" noChangeArrowheads="1"/>
+                    </pic:cNvPicPr>
+                  </pic:nvPicPr>
+                  <pic:blipFill>
+                    <a:blip r:embed="rId8" cstate="none"/>
+                    <a:srcRect/>
+                    <a:stretch>
+                      <a:fillRect/>
+                    </a:stretch>
+                  </pic:blipFill>
+                  <pic:spPr bwMode="auto">
+                    <a:xfrm>
+                      <a:off x="0" y="0"/>
+                      <a:ext cx="5905500" cy="1295400"/>
+                    </a:xfrm>
+                    <a:prstGeom prst="rect">
+                      <a:avLst/>
+                    </a:prstGeom>
+                  </pic:spPr>
+                </pic:pic>
+              </a:graphicData>
+            </a:graphic>
+          </wp:inline>
+        </w:drawing>
+      </w:r>
+    </w:p>
     <w:p/>
     <w:p>
       <w:pPr>

</xml_diff>